<commit_message>
Nombre del estudiante y cuaderno sin comentarios en el código
Co-Authored-By: Claude Opus 5.5 <noreply@anthropic.com>
Claude-Session: https://claude.ai/code/session_018Wvnh9QXrvmMcsgKeaoV75
</commit_message>
<xml_diff>
--- a/laboratorio1_zipf_moby_dick.docx
+++ b/laboratorio1_zipf_moby_dick.docx
@@ -13,11 +13,20 @@
     </w:p>
     <w:p>
       <w:pPr>
+        <w:spacing w:after="80"/>
+        <w:jc w:val="center"/>
+      </w:pPr>
+      <w:r>
+        <w:t xml:space="preserve">Análisis experimental del corpus Moby Dick de Herman Melville</w:t>
+      </w:r>
+    </w:p>
+    <w:p>
+      <w:pPr>
         <w:spacing w:after="300"/>
         <w:jc w:val="center"/>
       </w:pPr>
       <w:r>
-        <w:t xml:space="preserve">Análisis experimental del corpus Moby Dick de Herman Melville</w:t>
+        <w:t xml:space="preserve">Estudiante: Cristian Bastidas</w:t>
       </w:r>
     </w:p>
     <w:p>

</xml_diff>

<commit_message>
Informe en PDF y tablas sin cortes entre páginas
Co-Authored-By: Claude Opus 5.5 <noreply@anthropic.com>
Claude-Session: https://claude.ai/code/session_018Wvnh9QXrvmMcsgKeaoV75
</commit_message>
<xml_diff>
--- a/laboratorio1_zipf_moby_dick.docx
+++ b/laboratorio1_zipf_moby_dick.docx
@@ -142,6 +142,9 @@
         <w:gridCol w:w="3600"/>
       </w:tblGrid>
       <w:tr>
+        <w:trPr>
+          <w:cantSplit/>
+        </w:trPr>
         <w:tc>
           <w:tcPr>
             <w:tcW w:type="dxa" w:w="5426"/>
@@ -160,6 +163,8 @@
           </w:tcPr>
           <w:p>
             <w:pPr>
+              <w:keepNext/>
+              <w:keepLines/>
               <w:jc w:val="left"/>
             </w:pPr>
             <w:r>
@@ -191,6 +196,8 @@
           </w:tcPr>
           <w:p>
             <w:pPr>
+              <w:keepNext/>
+              <w:keepLines/>
               <w:jc w:val="center"/>
             </w:pPr>
             <w:r>
@@ -206,6 +213,9 @@
         </w:tc>
       </w:tr>
       <w:tr>
+        <w:trPr>
+          <w:cantSplit/>
+        </w:trPr>
         <w:tc>
           <w:tcPr>
             <w:tcW w:type="dxa" w:w="5426"/>
@@ -224,6 +234,8 @@
           </w:tcPr>
           <w:p>
             <w:pPr>
+              <w:keepNext/>
+              <w:keepLines/>
               <w:jc w:val="left"/>
             </w:pPr>
             <w:r>
@@ -255,6 +267,8 @@
           </w:tcPr>
           <w:p>
             <w:pPr>
+              <w:keepNext/>
+              <w:keepLines/>
               <w:jc w:val="center"/>
             </w:pPr>
             <w:r>
@@ -270,6 +284,9 @@
         </w:tc>
       </w:tr>
       <w:tr>
+        <w:trPr>
+          <w:cantSplit/>
+        </w:trPr>
         <w:tc>
           <w:tcPr>
             <w:tcW w:type="dxa" w:w="5426"/>
@@ -288,6 +305,8 @@
           </w:tcPr>
           <w:p>
             <w:pPr>
+              <w:keepNext/>
+              <w:keepLines/>
               <w:jc w:val="left"/>
             </w:pPr>
             <w:r>
@@ -319,6 +338,8 @@
           </w:tcPr>
           <w:p>
             <w:pPr>
+              <w:keepNext/>
+              <w:keepLines/>
               <w:jc w:val="center"/>
             </w:pPr>
             <w:r>
@@ -334,6 +355,9 @@
         </w:tc>
       </w:tr>
       <w:tr>
+        <w:trPr>
+          <w:cantSplit/>
+        </w:trPr>
         <w:tc>
           <w:tcPr>
             <w:tcW w:type="dxa" w:w="5426"/>
@@ -352,6 +376,8 @@
           </w:tcPr>
           <w:p>
             <w:pPr>
+              <w:keepNext/>
+              <w:keepLines/>
               <w:jc w:val="left"/>
             </w:pPr>
             <w:r>
@@ -383,6 +409,8 @@
           </w:tcPr>
           <w:p>
             <w:pPr>
+              <w:keepNext/>
+              <w:keepLines/>
               <w:jc w:val="center"/>
             </w:pPr>
             <w:r>
@@ -398,6 +426,9 @@
         </w:tc>
       </w:tr>
       <w:tr>
+        <w:trPr>
+          <w:cantSplit/>
+        </w:trPr>
         <w:tc>
           <w:tcPr>
             <w:tcW w:type="dxa" w:w="5426"/>
@@ -416,6 +447,8 @@
           </w:tcPr>
           <w:p>
             <w:pPr>
+              <w:keepNext/>
+              <w:keepLines/>
               <w:jc w:val="left"/>
             </w:pPr>
             <w:r>
@@ -447,6 +480,8 @@
           </w:tcPr>
           <w:p>
             <w:pPr>
+              <w:keepNext/>
+              <w:keepLines/>
               <w:jc w:val="center"/>
             </w:pPr>
             <w:r>
@@ -462,6 +497,9 @@
         </w:tc>
       </w:tr>
       <w:tr>
+        <w:trPr>
+          <w:cantSplit/>
+        </w:trPr>
         <w:tc>
           <w:tcPr>
             <w:tcW w:type="dxa" w:w="5426"/>
@@ -480,6 +518,8 @@
           </w:tcPr>
           <w:p>
             <w:pPr>
+              <w:keepNext/>
+              <w:keepLines/>
               <w:jc w:val="left"/>
             </w:pPr>
             <w:r>
@@ -511,6 +551,8 @@
           </w:tcPr>
           <w:p>
             <w:pPr>
+              <w:keepNext/>
+              <w:keepLines/>
               <w:jc w:val="center"/>
             </w:pPr>
             <w:r>
@@ -526,6 +568,9 @@
         </w:tc>
       </w:tr>
       <w:tr>
+        <w:trPr>
+          <w:cantSplit/>
+        </w:trPr>
         <w:tc>
           <w:tcPr>
             <w:tcW w:type="dxa" w:w="5426"/>
@@ -544,6 +589,8 @@
           </w:tcPr>
           <w:p>
             <w:pPr>
+              <w:keepNext/>
+              <w:keepLines/>
               <w:jc w:val="left"/>
             </w:pPr>
             <w:r>
@@ -575,6 +622,8 @@
           </w:tcPr>
           <w:p>
             <w:pPr>
+              <w:keepNext/>
+              <w:keepLines/>
               <w:jc w:val="center"/>
             </w:pPr>
             <w:r>
@@ -590,6 +639,9 @@
         </w:tc>
       </w:tr>
       <w:tr>
+        <w:trPr>
+          <w:cantSplit/>
+        </w:trPr>
         <w:tc>
           <w:tcPr>
             <w:tcW w:type="dxa" w:w="5426"/>
@@ -608,6 +660,8 @@
           </w:tcPr>
           <w:p>
             <w:pPr>
+              <w:keepNext/>
+              <w:keepLines/>
               <w:jc w:val="left"/>
             </w:pPr>
             <w:r>
@@ -639,6 +693,8 @@
           </w:tcPr>
           <w:p>
             <w:pPr>
+              <w:keepNext/>
+              <w:keepLines/>
               <w:jc w:val="center"/>
             </w:pPr>
             <w:r>
@@ -654,6 +710,9 @@
         </w:tc>
       </w:tr>
       <w:tr>
+        <w:trPr>
+          <w:cantSplit/>
+        </w:trPr>
         <w:tc>
           <w:tcPr>
             <w:tcW w:type="dxa" w:w="5426"/>
@@ -672,6 +731,8 @@
           </w:tcPr>
           <w:p>
             <w:pPr>
+              <w:keepNext/>
+              <w:keepLines/>
               <w:jc w:val="left"/>
             </w:pPr>
             <w:r>
@@ -703,6 +764,8 @@
           </w:tcPr>
           <w:p>
             <w:pPr>
+              <w:keepNext/>
+              <w:keepLines/>
               <w:jc w:val="center"/>
             </w:pPr>
             <w:r>
@@ -768,6 +831,9 @@
         <w:gridCol w:w="2257"/>
       </w:tblGrid>
       <w:tr>
+        <w:trPr>
+          <w:cantSplit/>
+        </w:trPr>
         <w:tc>
           <w:tcPr>
             <w:tcW w:type="dxa" w:w="2256"/>
@@ -786,6 +852,8 @@
           </w:tcPr>
           <w:p>
             <w:pPr>
+              <w:keepNext/>
+              <w:keepLines/>
               <w:jc w:val="left"/>
             </w:pPr>
             <w:r>
@@ -817,6 +885,8 @@
           </w:tcPr>
           <w:p>
             <w:pPr>
+              <w:keepNext/>
+              <w:keepLines/>
               <w:jc w:val="center"/>
             </w:pPr>
             <w:r>
@@ -848,6 +918,8 @@
           </w:tcPr>
           <w:p>
             <w:pPr>
+              <w:keepNext/>
+              <w:keepLines/>
               <w:jc w:val="center"/>
             </w:pPr>
             <w:r>
@@ -879,6 +951,8 @@
           </w:tcPr>
           <w:p>
             <w:pPr>
+              <w:keepNext/>
+              <w:keepLines/>
               <w:jc w:val="center"/>
             </w:pPr>
             <w:r>
@@ -894,6 +968,9 @@
         </w:tc>
       </w:tr>
       <w:tr>
+        <w:trPr>
+          <w:cantSplit/>
+        </w:trPr>
         <w:tc>
           <w:tcPr>
             <w:tcW w:type="dxa" w:w="2256"/>
@@ -912,6 +989,8 @@
           </w:tcPr>
           <w:p>
             <w:pPr>
+              <w:keepNext/>
+              <w:keepLines/>
               <w:jc w:val="left"/>
             </w:pPr>
             <w:r>
@@ -943,6 +1022,8 @@
           </w:tcPr>
           <w:p>
             <w:pPr>
+              <w:keepNext/>
+              <w:keepLines/>
               <w:jc w:val="center"/>
             </w:pPr>
             <w:r>
@@ -974,6 +1055,8 @@
           </w:tcPr>
           <w:p>
             <w:pPr>
+              <w:keepNext/>
+              <w:keepLines/>
               <w:jc w:val="center"/>
             </w:pPr>
             <w:r>
@@ -1005,6 +1088,8 @@
           </w:tcPr>
           <w:p>
             <w:pPr>
+              <w:keepNext/>
+              <w:keepLines/>
               <w:jc w:val="center"/>
             </w:pPr>
             <w:r>
@@ -1020,6 +1105,9 @@
         </w:tc>
       </w:tr>
       <w:tr>
+        <w:trPr>
+          <w:cantSplit/>
+        </w:trPr>
         <w:tc>
           <w:tcPr>
             <w:tcW w:type="dxa" w:w="2256"/>
@@ -1038,6 +1126,8 @@
           </w:tcPr>
           <w:p>
             <w:pPr>
+              <w:keepNext/>
+              <w:keepLines/>
               <w:jc w:val="left"/>
             </w:pPr>
             <w:r>
@@ -1069,6 +1159,8 @@
           </w:tcPr>
           <w:p>
             <w:pPr>
+              <w:keepNext/>
+              <w:keepLines/>
               <w:jc w:val="center"/>
             </w:pPr>
             <w:r>
@@ -1100,6 +1192,8 @@
           </w:tcPr>
           <w:p>
             <w:pPr>
+              <w:keepNext/>
+              <w:keepLines/>
               <w:jc w:val="center"/>
             </w:pPr>
             <w:r>
@@ -1131,6 +1225,8 @@
           </w:tcPr>
           <w:p>
             <w:pPr>
+              <w:keepNext/>
+              <w:keepLines/>
               <w:jc w:val="center"/>
             </w:pPr>
             <w:r>
@@ -1146,6 +1242,9 @@
         </w:tc>
       </w:tr>
       <w:tr>
+        <w:trPr>
+          <w:cantSplit/>
+        </w:trPr>
         <w:tc>
           <w:tcPr>
             <w:tcW w:type="dxa" w:w="2256"/>
@@ -1164,6 +1263,8 @@
           </w:tcPr>
           <w:p>
             <w:pPr>
+              <w:keepNext/>
+              <w:keepLines/>
               <w:jc w:val="left"/>
             </w:pPr>
             <w:r>
@@ -1195,6 +1296,8 @@
           </w:tcPr>
           <w:p>
             <w:pPr>
+              <w:keepNext/>
+              <w:keepLines/>
               <w:jc w:val="center"/>
             </w:pPr>
             <w:r>
@@ -1226,6 +1329,8 @@
           </w:tcPr>
           <w:p>
             <w:pPr>
+              <w:keepNext/>
+              <w:keepLines/>
               <w:jc w:val="center"/>
             </w:pPr>
             <w:r>
@@ -1257,6 +1362,8 @@
           </w:tcPr>
           <w:p>
             <w:pPr>
+              <w:keepNext/>
+              <w:keepLines/>
               <w:jc w:val="center"/>
             </w:pPr>
             <w:r>
@@ -1272,6 +1379,9 @@
         </w:tc>
       </w:tr>
       <w:tr>
+        <w:trPr>
+          <w:cantSplit/>
+        </w:trPr>
         <w:tc>
           <w:tcPr>
             <w:tcW w:type="dxa" w:w="2256"/>
@@ -1290,6 +1400,8 @@
           </w:tcPr>
           <w:p>
             <w:pPr>
+              <w:keepNext/>
+              <w:keepLines/>
               <w:jc w:val="left"/>
             </w:pPr>
             <w:r>
@@ -1321,6 +1433,8 @@
           </w:tcPr>
           <w:p>
             <w:pPr>
+              <w:keepNext/>
+              <w:keepLines/>
               <w:jc w:val="center"/>
             </w:pPr>
             <w:r>
@@ -1352,6 +1466,8 @@
           </w:tcPr>
           <w:p>
             <w:pPr>
+              <w:keepNext/>
+              <w:keepLines/>
               <w:jc w:val="center"/>
             </w:pPr>
             <w:r>
@@ -1383,6 +1499,8 @@
           </w:tcPr>
           <w:p>
             <w:pPr>
+              <w:keepNext/>
+              <w:keepLines/>
               <w:jc w:val="center"/>
             </w:pPr>
             <w:r>
@@ -1398,6 +1516,9 @@
         </w:tc>
       </w:tr>
       <w:tr>
+        <w:trPr>
+          <w:cantSplit/>
+        </w:trPr>
         <w:tc>
           <w:tcPr>
             <w:tcW w:type="dxa" w:w="2256"/>
@@ -1416,6 +1537,8 @@
           </w:tcPr>
           <w:p>
             <w:pPr>
+              <w:keepNext/>
+              <w:keepLines/>
               <w:jc w:val="left"/>
             </w:pPr>
             <w:r>
@@ -1447,6 +1570,8 @@
           </w:tcPr>
           <w:p>
             <w:pPr>
+              <w:keepNext/>
+              <w:keepLines/>
               <w:jc w:val="center"/>
             </w:pPr>
             <w:r>
@@ -1478,6 +1603,8 @@
           </w:tcPr>
           <w:p>
             <w:pPr>
+              <w:keepNext/>
+              <w:keepLines/>
               <w:jc w:val="center"/>
             </w:pPr>
             <w:r>
@@ -1509,6 +1636,8 @@
           </w:tcPr>
           <w:p>
             <w:pPr>
+              <w:keepNext/>
+              <w:keepLines/>
               <w:jc w:val="center"/>
             </w:pPr>
             <w:r>
@@ -1524,6 +1653,9 @@
         </w:tc>
       </w:tr>
       <w:tr>
+        <w:trPr>
+          <w:cantSplit/>
+        </w:trPr>
         <w:tc>
           <w:tcPr>
             <w:tcW w:type="dxa" w:w="2256"/>
@@ -1542,6 +1674,8 @@
           </w:tcPr>
           <w:p>
             <w:pPr>
+              <w:keepNext/>
+              <w:keepLines/>
               <w:jc w:val="left"/>
             </w:pPr>
             <w:r>
@@ -1573,6 +1707,8 @@
           </w:tcPr>
           <w:p>
             <w:pPr>
+              <w:keepNext/>
+              <w:keepLines/>
               <w:jc w:val="center"/>
             </w:pPr>
             <w:r>
@@ -1604,6 +1740,8 @@
           </w:tcPr>
           <w:p>
             <w:pPr>
+              <w:keepNext/>
+              <w:keepLines/>
               <w:jc w:val="center"/>
             </w:pPr>
             <w:r>
@@ -1635,6 +1773,8 @@
           </w:tcPr>
           <w:p>
             <w:pPr>
+              <w:keepNext/>
+              <w:keepLines/>
               <w:jc w:val="center"/>
             </w:pPr>
             <w:r>
@@ -1650,6 +1790,9 @@
         </w:tc>
       </w:tr>
       <w:tr>
+        <w:trPr>
+          <w:cantSplit/>
+        </w:trPr>
         <w:tc>
           <w:tcPr>
             <w:tcW w:type="dxa" w:w="2256"/>
@@ -1668,6 +1811,8 @@
           </w:tcPr>
           <w:p>
             <w:pPr>
+              <w:keepNext/>
+              <w:keepLines/>
               <w:jc w:val="left"/>
             </w:pPr>
             <w:r>
@@ -1699,6 +1844,8 @@
           </w:tcPr>
           <w:p>
             <w:pPr>
+              <w:keepNext/>
+              <w:keepLines/>
               <w:jc w:val="center"/>
             </w:pPr>
             <w:r>
@@ -1730,6 +1877,8 @@
           </w:tcPr>
           <w:p>
             <w:pPr>
+              <w:keepNext/>
+              <w:keepLines/>
               <w:jc w:val="center"/>
             </w:pPr>
             <w:r>
@@ -1761,6 +1910,8 @@
           </w:tcPr>
           <w:p>
             <w:pPr>
+              <w:keepNext/>
+              <w:keepLines/>
               <w:jc w:val="center"/>
             </w:pPr>
             <w:r>
@@ -1776,6 +1927,9 @@
         </w:tc>
       </w:tr>
       <w:tr>
+        <w:trPr>
+          <w:cantSplit/>
+        </w:trPr>
         <w:tc>
           <w:tcPr>
             <w:tcW w:type="dxa" w:w="2256"/>
@@ -1794,6 +1948,8 @@
           </w:tcPr>
           <w:p>
             <w:pPr>
+              <w:keepNext/>
+              <w:keepLines/>
               <w:jc w:val="left"/>
             </w:pPr>
             <w:r>
@@ -1825,6 +1981,8 @@
           </w:tcPr>
           <w:p>
             <w:pPr>
+              <w:keepNext/>
+              <w:keepLines/>
               <w:jc w:val="center"/>
             </w:pPr>
             <w:r>
@@ -1856,6 +2014,8 @@
           </w:tcPr>
           <w:p>
             <w:pPr>
+              <w:keepNext/>
+              <w:keepLines/>
               <w:jc w:val="center"/>
             </w:pPr>
             <w:r>
@@ -1887,6 +2047,8 @@
           </w:tcPr>
           <w:p>
             <w:pPr>
+              <w:keepNext/>
+              <w:keepLines/>
               <w:jc w:val="center"/>
             </w:pPr>
             <w:r>
@@ -1902,6 +2064,9 @@
         </w:tc>
       </w:tr>
       <w:tr>
+        <w:trPr>
+          <w:cantSplit/>
+        </w:trPr>
         <w:tc>
           <w:tcPr>
             <w:tcW w:type="dxa" w:w="2256"/>
@@ -1920,6 +2085,8 @@
           </w:tcPr>
           <w:p>
             <w:pPr>
+              <w:keepNext/>
+              <w:keepLines/>
               <w:jc w:val="left"/>
             </w:pPr>
             <w:r>
@@ -1951,6 +2118,8 @@
           </w:tcPr>
           <w:p>
             <w:pPr>
+              <w:keepNext/>
+              <w:keepLines/>
               <w:jc w:val="center"/>
             </w:pPr>
             <w:r>
@@ -1982,6 +2151,8 @@
           </w:tcPr>
           <w:p>
             <w:pPr>
+              <w:keepNext/>
+              <w:keepLines/>
               <w:jc w:val="center"/>
             </w:pPr>
             <w:r>
@@ -2013,6 +2184,8 @@
           </w:tcPr>
           <w:p>
             <w:pPr>
+              <w:keepNext/>
+              <w:keepLines/>
               <w:jc w:val="center"/>
             </w:pPr>
             <w:r>
@@ -2028,6 +2201,9 @@
         </w:tc>
       </w:tr>
       <w:tr>
+        <w:trPr>
+          <w:cantSplit/>
+        </w:trPr>
         <w:tc>
           <w:tcPr>
             <w:tcW w:type="dxa" w:w="2256"/>
@@ -2046,6 +2222,8 @@
           </w:tcPr>
           <w:p>
             <w:pPr>
+              <w:keepNext/>
+              <w:keepLines/>
               <w:jc w:val="left"/>
             </w:pPr>
             <w:r>
@@ -2077,6 +2255,8 @@
           </w:tcPr>
           <w:p>
             <w:pPr>
+              <w:keepNext/>
+              <w:keepLines/>
               <w:jc w:val="center"/>
             </w:pPr>
             <w:r>
@@ -2108,6 +2288,8 @@
           </w:tcPr>
           <w:p>
             <w:pPr>
+              <w:keepNext/>
+              <w:keepLines/>
               <w:jc w:val="center"/>
             </w:pPr>
             <w:r>
@@ -2139,6 +2321,8 @@
           </w:tcPr>
           <w:p>
             <w:pPr>
+              <w:keepNext/>
+              <w:keepLines/>
               <w:jc w:val="center"/>
             </w:pPr>
             <w:r>
@@ -2412,6 +2596,9 @@
         <w:gridCol w:w="1400"/>
       </w:tblGrid>
       <w:tr>
+        <w:trPr>
+          <w:cantSplit/>
+        </w:trPr>
         <w:tc>
           <w:tcPr>
             <w:tcW w:type="dxa" w:w="2326"/>
@@ -2430,6 +2617,8 @@
           </w:tcPr>
           <w:p>
             <w:pPr>
+              <w:keepNext/>
+              <w:keepLines/>
               <w:jc w:val="left"/>
             </w:pPr>
             <w:r>
@@ -2461,6 +2650,8 @@
           </w:tcPr>
           <w:p>
             <w:pPr>
+              <w:keepNext/>
+              <w:keepLines/>
               <w:jc w:val="center"/>
             </w:pPr>
             <w:r>
@@ -2492,6 +2683,8 @@
           </w:tcPr>
           <w:p>
             <w:pPr>
+              <w:keepNext/>
+              <w:keepLines/>
               <w:jc w:val="center"/>
             </w:pPr>
             <w:r>
@@ -2523,6 +2716,8 @@
           </w:tcPr>
           <w:p>
             <w:pPr>
+              <w:keepNext/>
+              <w:keepLines/>
               <w:jc w:val="center"/>
             </w:pPr>
             <w:r>
@@ -2554,6 +2749,8 @@
           </w:tcPr>
           <w:p>
             <w:pPr>
+              <w:keepNext/>
+              <w:keepLines/>
               <w:jc w:val="center"/>
             </w:pPr>
             <w:r>
@@ -2585,6 +2782,8 @@
           </w:tcPr>
           <w:p>
             <w:pPr>
+              <w:keepNext/>
+              <w:keepLines/>
               <w:jc w:val="center"/>
             </w:pPr>
             <w:r>
@@ -2616,6 +2815,8 @@
           </w:tcPr>
           <w:p>
             <w:pPr>
+              <w:keepNext/>
+              <w:keepLines/>
               <w:jc w:val="center"/>
             </w:pPr>
             <w:r>
@@ -2647,6 +2848,8 @@
           </w:tcPr>
           <w:p>
             <w:pPr>
+              <w:keepNext/>
+              <w:keepLines/>
               <w:jc w:val="center"/>
             </w:pPr>
             <w:r>
@@ -2662,6 +2865,9 @@
         </w:tc>
       </w:tr>
       <w:tr>
+        <w:trPr>
+          <w:cantSplit/>
+        </w:trPr>
         <w:tc>
           <w:tcPr>
             <w:tcW w:type="dxa" w:w="2326"/>
@@ -2680,6 +2886,8 @@
           </w:tcPr>
           <w:p>
             <w:pPr>
+              <w:keepNext/>
+              <w:keepLines/>
               <w:jc w:val="left"/>
             </w:pPr>
             <w:r>
@@ -2711,6 +2919,8 @@
           </w:tcPr>
           <w:p>
             <w:pPr>
+              <w:keepNext/>
+              <w:keepLines/>
               <w:jc w:val="center"/>
             </w:pPr>
             <w:r>
@@ -2742,6 +2952,8 @@
           </w:tcPr>
           <w:p>
             <w:pPr>
+              <w:keepNext/>
+              <w:keepLines/>
               <w:jc w:val="center"/>
             </w:pPr>
             <w:r>
@@ -2773,6 +2985,8 @@
           </w:tcPr>
           <w:p>
             <w:pPr>
+              <w:keepNext/>
+              <w:keepLines/>
               <w:jc w:val="center"/>
             </w:pPr>
             <w:r>
@@ -2804,6 +3018,8 @@
           </w:tcPr>
           <w:p>
             <w:pPr>
+              <w:keepNext/>
+              <w:keepLines/>
               <w:jc w:val="center"/>
             </w:pPr>
             <w:r>
@@ -2835,6 +3051,8 @@
           </w:tcPr>
           <w:p>
             <w:pPr>
+              <w:keepNext/>
+              <w:keepLines/>
               <w:jc w:val="center"/>
             </w:pPr>
             <w:r>
@@ -2866,6 +3084,8 @@
           </w:tcPr>
           <w:p>
             <w:pPr>
+              <w:keepNext/>
+              <w:keepLines/>
               <w:jc w:val="center"/>
             </w:pPr>
             <w:r>
@@ -2897,6 +3117,8 @@
           </w:tcPr>
           <w:p>
             <w:pPr>
+              <w:keepNext/>
+              <w:keepLines/>
               <w:jc w:val="center"/>
             </w:pPr>
             <w:r>
@@ -2912,6 +3134,9 @@
         </w:tc>
       </w:tr>
       <w:tr>
+        <w:trPr>
+          <w:cantSplit/>
+        </w:trPr>
         <w:tc>
           <w:tcPr>
             <w:tcW w:type="dxa" w:w="2326"/>
@@ -2930,6 +3155,8 @@
           </w:tcPr>
           <w:p>
             <w:pPr>
+              <w:keepNext/>
+              <w:keepLines/>
               <w:jc w:val="left"/>
             </w:pPr>
             <w:r>
@@ -2961,6 +3188,8 @@
           </w:tcPr>
           <w:p>
             <w:pPr>
+              <w:keepNext/>
+              <w:keepLines/>
               <w:jc w:val="center"/>
             </w:pPr>
             <w:r>
@@ -2992,6 +3221,8 @@
           </w:tcPr>
           <w:p>
             <w:pPr>
+              <w:keepNext/>
+              <w:keepLines/>
               <w:jc w:val="center"/>
             </w:pPr>
             <w:r>
@@ -3023,6 +3254,8 @@
           </w:tcPr>
           <w:p>
             <w:pPr>
+              <w:keepNext/>
+              <w:keepLines/>
               <w:jc w:val="center"/>
             </w:pPr>
             <w:r>
@@ -3054,6 +3287,8 @@
           </w:tcPr>
           <w:p>
             <w:pPr>
+              <w:keepNext/>
+              <w:keepLines/>
               <w:jc w:val="center"/>
             </w:pPr>
             <w:r>
@@ -3085,6 +3320,8 @@
           </w:tcPr>
           <w:p>
             <w:pPr>
+              <w:keepNext/>
+              <w:keepLines/>
               <w:jc w:val="center"/>
             </w:pPr>
             <w:r>
@@ -3116,6 +3353,8 @@
           </w:tcPr>
           <w:p>
             <w:pPr>
+              <w:keepNext/>
+              <w:keepLines/>
               <w:jc w:val="center"/>
             </w:pPr>
             <w:r>
@@ -3147,6 +3386,8 @@
           </w:tcPr>
           <w:p>
             <w:pPr>
+              <w:keepNext/>
+              <w:keepLines/>
               <w:jc w:val="center"/>
             </w:pPr>
             <w:r>
@@ -3162,6 +3403,9 @@
         </w:tc>
       </w:tr>
       <w:tr>
+        <w:trPr>
+          <w:cantSplit/>
+        </w:trPr>
         <w:tc>
           <w:tcPr>
             <w:tcW w:type="dxa" w:w="2326"/>
@@ -3180,6 +3424,8 @@
           </w:tcPr>
           <w:p>
             <w:pPr>
+              <w:keepNext/>
+              <w:keepLines/>
               <w:jc w:val="left"/>
             </w:pPr>
             <w:r>
@@ -3211,6 +3457,8 @@
           </w:tcPr>
           <w:p>
             <w:pPr>
+              <w:keepNext/>
+              <w:keepLines/>
               <w:jc w:val="center"/>
             </w:pPr>
             <w:r>
@@ -3242,6 +3490,8 @@
           </w:tcPr>
           <w:p>
             <w:pPr>
+              <w:keepNext/>
+              <w:keepLines/>
               <w:jc w:val="center"/>
             </w:pPr>
             <w:r>
@@ -3273,6 +3523,8 @@
           </w:tcPr>
           <w:p>
             <w:pPr>
+              <w:keepNext/>
+              <w:keepLines/>
               <w:jc w:val="center"/>
             </w:pPr>
             <w:r>
@@ -3304,6 +3556,8 @@
           </w:tcPr>
           <w:p>
             <w:pPr>
+              <w:keepNext/>
+              <w:keepLines/>
               <w:jc w:val="center"/>
             </w:pPr>
             <w:r>
@@ -3335,6 +3589,8 @@
           </w:tcPr>
           <w:p>
             <w:pPr>
+              <w:keepNext/>
+              <w:keepLines/>
               <w:jc w:val="center"/>
             </w:pPr>
             <w:r>
@@ -3366,6 +3622,8 @@
           </w:tcPr>
           <w:p>
             <w:pPr>
+              <w:keepNext/>
+              <w:keepLines/>
               <w:jc w:val="center"/>
             </w:pPr>
             <w:r>
@@ -3397,6 +3655,8 @@
           </w:tcPr>
           <w:p>
             <w:pPr>
+              <w:keepNext/>
+              <w:keepLines/>
               <w:jc w:val="center"/>
             </w:pPr>
             <w:r>
@@ -3412,6 +3672,9 @@
         </w:tc>
       </w:tr>
       <w:tr>
+        <w:trPr>
+          <w:cantSplit/>
+        </w:trPr>
         <w:tc>
           <w:tcPr>
             <w:tcW w:type="dxa" w:w="2326"/>
@@ -3430,6 +3693,8 @@
           </w:tcPr>
           <w:p>
             <w:pPr>
+              <w:keepNext/>
+              <w:keepLines/>
               <w:jc w:val="left"/>
             </w:pPr>
             <w:r>
@@ -3461,6 +3726,8 @@
           </w:tcPr>
           <w:p>
             <w:pPr>
+              <w:keepNext/>
+              <w:keepLines/>
               <w:jc w:val="center"/>
             </w:pPr>
             <w:r>
@@ -3492,6 +3759,8 @@
           </w:tcPr>
           <w:p>
             <w:pPr>
+              <w:keepNext/>
+              <w:keepLines/>
               <w:jc w:val="center"/>
             </w:pPr>
             <w:r>
@@ -3523,6 +3792,8 @@
           </w:tcPr>
           <w:p>
             <w:pPr>
+              <w:keepNext/>
+              <w:keepLines/>
               <w:jc w:val="center"/>
             </w:pPr>
             <w:r>
@@ -3554,6 +3825,8 @@
           </w:tcPr>
           <w:p>
             <w:pPr>
+              <w:keepNext/>
+              <w:keepLines/>
               <w:jc w:val="center"/>
             </w:pPr>
             <w:r>
@@ -3585,6 +3858,8 @@
           </w:tcPr>
           <w:p>
             <w:pPr>
+              <w:keepNext/>
+              <w:keepLines/>
               <w:jc w:val="center"/>
             </w:pPr>
             <w:r>
@@ -3616,6 +3891,8 @@
           </w:tcPr>
           <w:p>
             <w:pPr>
+              <w:keepNext/>
+              <w:keepLines/>
               <w:jc w:val="center"/>
             </w:pPr>
             <w:r>
@@ -3647,6 +3924,8 @@
           </w:tcPr>
           <w:p>
             <w:pPr>
+              <w:keepNext/>
+              <w:keepLines/>
               <w:jc w:val="center"/>
             </w:pPr>
             <w:r>
@@ -3750,6 +4029,9 @@
         <w:gridCol w:w="1300"/>
       </w:tblGrid>
       <w:tr>
+        <w:trPr>
+          <w:cantSplit/>
+        </w:trPr>
         <w:tc>
           <w:tcPr>
             <w:tcW w:type="dxa" w:w="1426"/>
@@ -3768,6 +4050,8 @@
           </w:tcPr>
           <w:p>
             <w:pPr>
+              <w:keepNext/>
+              <w:keepLines/>
               <w:jc w:val="left"/>
             </w:pPr>
             <w:r>
@@ -3799,6 +4083,8 @@
           </w:tcPr>
           <w:p>
             <w:pPr>
+              <w:keepNext/>
+              <w:keepLines/>
               <w:jc w:val="center"/>
             </w:pPr>
             <w:r>
@@ -3830,6 +4116,8 @@
           </w:tcPr>
           <w:p>
             <w:pPr>
+              <w:keepNext/>
+              <w:keepLines/>
               <w:jc w:val="center"/>
             </w:pPr>
             <w:r>
@@ -3861,6 +4149,8 @@
           </w:tcPr>
           <w:p>
             <w:pPr>
+              <w:keepNext/>
+              <w:keepLines/>
               <w:jc w:val="center"/>
             </w:pPr>
             <w:r>
@@ -3892,6 +4182,8 @@
           </w:tcPr>
           <w:p>
             <w:pPr>
+              <w:keepNext/>
+              <w:keepLines/>
               <w:jc w:val="center"/>
             </w:pPr>
             <w:r>
@@ -3923,6 +4215,8 @@
           </w:tcPr>
           <w:p>
             <w:pPr>
+              <w:keepNext/>
+              <w:keepLines/>
               <w:jc w:val="center"/>
             </w:pPr>
             <w:r>
@@ -3954,6 +4248,8 @@
           </w:tcPr>
           <w:p>
             <w:pPr>
+              <w:keepNext/>
+              <w:keepLines/>
               <w:jc w:val="center"/>
             </w:pPr>
             <w:r>
@@ -3969,6 +4265,9 @@
         </w:tc>
       </w:tr>
       <w:tr>
+        <w:trPr>
+          <w:cantSplit/>
+        </w:trPr>
         <w:tc>
           <w:tcPr>
             <w:tcW w:type="dxa" w:w="1426"/>
@@ -3987,6 +4286,8 @@
           </w:tcPr>
           <w:p>
             <w:pPr>
+              <w:keepNext/>
+              <w:keepLines/>
               <w:jc w:val="left"/>
             </w:pPr>
             <w:r>
@@ -4018,6 +4319,8 @@
           </w:tcPr>
           <w:p>
             <w:pPr>
+              <w:keepNext/>
+              <w:keepLines/>
               <w:jc w:val="center"/>
             </w:pPr>
             <w:r>
@@ -4049,6 +4352,8 @@
           </w:tcPr>
           <w:p>
             <w:pPr>
+              <w:keepNext/>
+              <w:keepLines/>
               <w:jc w:val="center"/>
             </w:pPr>
             <w:r>
@@ -4080,6 +4385,8 @@
           </w:tcPr>
           <w:p>
             <w:pPr>
+              <w:keepNext/>
+              <w:keepLines/>
               <w:jc w:val="center"/>
             </w:pPr>
             <w:r>
@@ -4111,6 +4418,8 @@
           </w:tcPr>
           <w:p>
             <w:pPr>
+              <w:keepNext/>
+              <w:keepLines/>
               <w:jc w:val="center"/>
             </w:pPr>
             <w:r>
@@ -4142,6 +4451,8 @@
           </w:tcPr>
           <w:p>
             <w:pPr>
+              <w:keepNext/>
+              <w:keepLines/>
               <w:jc w:val="center"/>
             </w:pPr>
             <w:r>
@@ -4173,6 +4484,8 @@
           </w:tcPr>
           <w:p>
             <w:pPr>
+              <w:keepNext/>
+              <w:keepLines/>
               <w:jc w:val="center"/>
             </w:pPr>
             <w:r>
@@ -4188,6 +4501,9 @@
         </w:tc>
       </w:tr>
       <w:tr>
+        <w:trPr>
+          <w:cantSplit/>
+        </w:trPr>
         <w:tc>
           <w:tcPr>
             <w:tcW w:type="dxa" w:w="1426"/>
@@ -4206,6 +4522,8 @@
           </w:tcPr>
           <w:p>
             <w:pPr>
+              <w:keepNext/>
+              <w:keepLines/>
               <w:jc w:val="left"/>
             </w:pPr>
             <w:r>
@@ -4237,6 +4555,8 @@
           </w:tcPr>
           <w:p>
             <w:pPr>
+              <w:keepNext/>
+              <w:keepLines/>
               <w:jc w:val="center"/>
             </w:pPr>
             <w:r>
@@ -4268,6 +4588,8 @@
           </w:tcPr>
           <w:p>
             <w:pPr>
+              <w:keepNext/>
+              <w:keepLines/>
               <w:jc w:val="center"/>
             </w:pPr>
             <w:r>
@@ -4299,6 +4621,8 @@
           </w:tcPr>
           <w:p>
             <w:pPr>
+              <w:keepNext/>
+              <w:keepLines/>
               <w:jc w:val="center"/>
             </w:pPr>
             <w:r>
@@ -4330,6 +4654,8 @@
           </w:tcPr>
           <w:p>
             <w:pPr>
+              <w:keepNext/>
+              <w:keepLines/>
               <w:jc w:val="center"/>
             </w:pPr>
             <w:r>
@@ -4361,6 +4687,8 @@
           </w:tcPr>
           <w:p>
             <w:pPr>
+              <w:keepNext/>
+              <w:keepLines/>
               <w:jc w:val="center"/>
             </w:pPr>
             <w:r>
@@ -4392,6 +4720,8 @@
           </w:tcPr>
           <w:p>
             <w:pPr>
+              <w:keepNext/>
+              <w:keepLines/>
               <w:jc w:val="center"/>
             </w:pPr>
             <w:r>
@@ -4407,6 +4737,9 @@
         </w:tc>
       </w:tr>
       <w:tr>
+        <w:trPr>
+          <w:cantSplit/>
+        </w:trPr>
         <w:tc>
           <w:tcPr>
             <w:tcW w:type="dxa" w:w="1426"/>
@@ -4425,6 +4758,8 @@
           </w:tcPr>
           <w:p>
             <w:pPr>
+              <w:keepNext/>
+              <w:keepLines/>
               <w:jc w:val="left"/>
             </w:pPr>
             <w:r>
@@ -4456,6 +4791,8 @@
           </w:tcPr>
           <w:p>
             <w:pPr>
+              <w:keepNext/>
+              <w:keepLines/>
               <w:jc w:val="center"/>
             </w:pPr>
             <w:r>
@@ -4487,6 +4824,8 @@
           </w:tcPr>
           <w:p>
             <w:pPr>
+              <w:keepNext/>
+              <w:keepLines/>
               <w:jc w:val="center"/>
             </w:pPr>
             <w:r>
@@ -4518,6 +4857,8 @@
           </w:tcPr>
           <w:p>
             <w:pPr>
+              <w:keepNext/>
+              <w:keepLines/>
               <w:jc w:val="center"/>
             </w:pPr>
             <w:r>
@@ -4549,6 +4890,8 @@
           </w:tcPr>
           <w:p>
             <w:pPr>
+              <w:keepNext/>
+              <w:keepLines/>
               <w:jc w:val="center"/>
             </w:pPr>
             <w:r>
@@ -4580,6 +4923,8 @@
           </w:tcPr>
           <w:p>
             <w:pPr>
+              <w:keepNext/>
+              <w:keepLines/>
               <w:jc w:val="center"/>
             </w:pPr>
             <w:r>
@@ -4611,6 +4956,8 @@
           </w:tcPr>
           <w:p>
             <w:pPr>
+              <w:keepNext/>
+              <w:keepLines/>
               <w:jc w:val="center"/>
             </w:pPr>
             <w:r>
@@ -4626,6 +4973,9 @@
         </w:tc>
       </w:tr>
       <w:tr>
+        <w:trPr>
+          <w:cantSplit/>
+        </w:trPr>
         <w:tc>
           <w:tcPr>
             <w:tcW w:type="dxa" w:w="1426"/>
@@ -4644,6 +4994,8 @@
           </w:tcPr>
           <w:p>
             <w:pPr>
+              <w:keepNext/>
+              <w:keepLines/>
               <w:jc w:val="left"/>
             </w:pPr>
             <w:r>
@@ -4675,6 +5027,8 @@
           </w:tcPr>
           <w:p>
             <w:pPr>
+              <w:keepNext/>
+              <w:keepLines/>
               <w:jc w:val="center"/>
             </w:pPr>
             <w:r>
@@ -4706,6 +5060,8 @@
           </w:tcPr>
           <w:p>
             <w:pPr>
+              <w:keepNext/>
+              <w:keepLines/>
               <w:jc w:val="center"/>
             </w:pPr>
             <w:r>
@@ -4737,6 +5093,8 @@
           </w:tcPr>
           <w:p>
             <w:pPr>
+              <w:keepNext/>
+              <w:keepLines/>
               <w:jc w:val="center"/>
             </w:pPr>
             <w:r>
@@ -4768,6 +5126,8 @@
           </w:tcPr>
           <w:p>
             <w:pPr>
+              <w:keepNext/>
+              <w:keepLines/>
               <w:jc w:val="center"/>
             </w:pPr>
             <w:r>
@@ -4799,6 +5159,8 @@
           </w:tcPr>
           <w:p>
             <w:pPr>
+              <w:keepNext/>
+              <w:keepLines/>
               <w:jc w:val="center"/>
             </w:pPr>
             <w:r>
@@ -4830,6 +5192,8 @@
           </w:tcPr>
           <w:p>
             <w:pPr>
+              <w:keepNext/>
+              <w:keepLines/>
               <w:jc w:val="center"/>
             </w:pPr>
             <w:r>
@@ -4845,6 +5209,9 @@
         </w:tc>
       </w:tr>
       <w:tr>
+        <w:trPr>
+          <w:cantSplit/>
+        </w:trPr>
         <w:tc>
           <w:tcPr>
             <w:tcW w:type="dxa" w:w="1426"/>
@@ -4863,6 +5230,8 @@
           </w:tcPr>
           <w:p>
             <w:pPr>
+              <w:keepNext/>
+              <w:keepLines/>
               <w:jc w:val="left"/>
             </w:pPr>
             <w:r>
@@ -4894,6 +5263,8 @@
           </w:tcPr>
           <w:p>
             <w:pPr>
+              <w:keepNext/>
+              <w:keepLines/>
               <w:jc w:val="center"/>
             </w:pPr>
             <w:r>
@@ -4925,6 +5296,8 @@
           </w:tcPr>
           <w:p>
             <w:pPr>
+              <w:keepNext/>
+              <w:keepLines/>
               <w:jc w:val="center"/>
             </w:pPr>
             <w:r>
@@ -4956,6 +5329,8 @@
           </w:tcPr>
           <w:p>
             <w:pPr>
+              <w:keepNext/>
+              <w:keepLines/>
               <w:jc w:val="center"/>
             </w:pPr>
             <w:r>
@@ -4987,6 +5362,8 @@
           </w:tcPr>
           <w:p>
             <w:pPr>
+              <w:keepNext/>
+              <w:keepLines/>
               <w:jc w:val="center"/>
             </w:pPr>
             <w:r>
@@ -5018,6 +5395,8 @@
           </w:tcPr>
           <w:p>
             <w:pPr>
+              <w:keepNext/>
+              <w:keepLines/>
               <w:jc w:val="center"/>
             </w:pPr>
             <w:r>
@@ -5049,6 +5428,8 @@
           </w:tcPr>
           <w:p>
             <w:pPr>
+              <w:keepNext/>
+              <w:keepLines/>
               <w:jc w:val="center"/>
             </w:pPr>
             <w:r>
@@ -5064,6 +5445,9 @@
         </w:tc>
       </w:tr>
       <w:tr>
+        <w:trPr>
+          <w:cantSplit/>
+        </w:trPr>
         <w:tc>
           <w:tcPr>
             <w:tcW w:type="dxa" w:w="1426"/>
@@ -5082,6 +5466,8 @@
           </w:tcPr>
           <w:p>
             <w:pPr>
+              <w:keepNext/>
+              <w:keepLines/>
               <w:jc w:val="left"/>
             </w:pPr>
             <w:r>
@@ -5113,6 +5499,8 @@
           </w:tcPr>
           <w:p>
             <w:pPr>
+              <w:keepNext/>
+              <w:keepLines/>
               <w:jc w:val="center"/>
             </w:pPr>
             <w:r>
@@ -5144,6 +5532,8 @@
           </w:tcPr>
           <w:p>
             <w:pPr>
+              <w:keepNext/>
+              <w:keepLines/>
               <w:jc w:val="center"/>
             </w:pPr>
             <w:r>
@@ -5175,6 +5565,8 @@
           </w:tcPr>
           <w:p>
             <w:pPr>
+              <w:keepNext/>
+              <w:keepLines/>
               <w:jc w:val="center"/>
             </w:pPr>
             <w:r>
@@ -5206,6 +5598,8 @@
           </w:tcPr>
           <w:p>
             <w:pPr>
+              <w:keepNext/>
+              <w:keepLines/>
               <w:jc w:val="center"/>
             </w:pPr>
             <w:r>
@@ -5237,6 +5631,8 @@
           </w:tcPr>
           <w:p>
             <w:pPr>
+              <w:keepNext/>
+              <w:keepLines/>
               <w:jc w:val="center"/>
             </w:pPr>
             <w:r>
@@ -5268,6 +5664,8 @@
           </w:tcPr>
           <w:p>
             <w:pPr>
+              <w:keepNext/>
+              <w:keepLines/>
               <w:jc w:val="center"/>
             </w:pPr>
             <w:r>
@@ -5400,6 +5798,9 @@
         <w:gridCol w:w="2200"/>
       </w:tblGrid>
       <w:tr>
+        <w:trPr>
+          <w:cantSplit/>
+        </w:trPr>
         <w:tc>
           <w:tcPr>
             <w:tcW w:type="dxa" w:w="2826"/>
@@ -5418,6 +5819,8 @@
           </w:tcPr>
           <w:p>
             <w:pPr>
+              <w:keepNext/>
+              <w:keepLines/>
               <w:jc w:val="left"/>
             </w:pPr>
             <w:r>
@@ -5449,6 +5852,8 @@
           </w:tcPr>
           <w:p>
             <w:pPr>
+              <w:keepNext/>
+              <w:keepLines/>
               <w:jc w:val="center"/>
             </w:pPr>
             <w:r>
@@ -5480,6 +5885,8 @@
           </w:tcPr>
           <w:p>
             <w:pPr>
+              <w:keepNext/>
+              <w:keepLines/>
               <w:jc w:val="center"/>
             </w:pPr>
             <w:r>
@@ -5511,6 +5918,8 @@
           </w:tcPr>
           <w:p>
             <w:pPr>
+              <w:keepNext/>
+              <w:keepLines/>
               <w:jc w:val="center"/>
             </w:pPr>
             <w:r>
@@ -5526,6 +5935,9 @@
         </w:tc>
       </w:tr>
       <w:tr>
+        <w:trPr>
+          <w:cantSplit/>
+        </w:trPr>
         <w:tc>
           <w:tcPr>
             <w:tcW w:type="dxa" w:w="2826"/>
@@ -5544,6 +5956,8 @@
           </w:tcPr>
           <w:p>
             <w:pPr>
+              <w:keepNext/>
+              <w:keepLines/>
               <w:jc w:val="left"/>
             </w:pPr>
             <w:r>
@@ -5575,6 +5989,8 @@
           </w:tcPr>
           <w:p>
             <w:pPr>
+              <w:keepNext/>
+              <w:keepLines/>
               <w:jc w:val="center"/>
             </w:pPr>
             <w:r>
@@ -5606,6 +6022,8 @@
           </w:tcPr>
           <w:p>
             <w:pPr>
+              <w:keepNext/>
+              <w:keepLines/>
               <w:jc w:val="center"/>
             </w:pPr>
             <w:r>
@@ -5637,6 +6055,8 @@
           </w:tcPr>
           <w:p>
             <w:pPr>
+              <w:keepNext/>
+              <w:keepLines/>
               <w:jc w:val="center"/>
             </w:pPr>
             <w:r>
@@ -5652,6 +6072,9 @@
         </w:tc>
       </w:tr>
       <w:tr>
+        <w:trPr>
+          <w:cantSplit/>
+        </w:trPr>
         <w:tc>
           <w:tcPr>
             <w:tcW w:type="dxa" w:w="2826"/>
@@ -5670,6 +6093,8 @@
           </w:tcPr>
           <w:p>
             <w:pPr>
+              <w:keepNext/>
+              <w:keepLines/>
               <w:jc w:val="left"/>
             </w:pPr>
             <w:r>
@@ -5701,6 +6126,8 @@
           </w:tcPr>
           <w:p>
             <w:pPr>
+              <w:keepNext/>
+              <w:keepLines/>
               <w:jc w:val="center"/>
             </w:pPr>
             <w:r>
@@ -5732,6 +6159,8 @@
           </w:tcPr>
           <w:p>
             <w:pPr>
+              <w:keepNext/>
+              <w:keepLines/>
               <w:jc w:val="center"/>
             </w:pPr>
             <w:r>
@@ -5763,6 +6192,8 @@
           </w:tcPr>
           <w:p>
             <w:pPr>
+              <w:keepNext/>
+              <w:keepLines/>
               <w:jc w:val="center"/>
             </w:pPr>
             <w:r>
@@ -5778,6 +6209,9 @@
         </w:tc>
       </w:tr>
       <w:tr>
+        <w:trPr>
+          <w:cantSplit/>
+        </w:trPr>
         <w:tc>
           <w:tcPr>
             <w:tcW w:type="dxa" w:w="2826"/>
@@ -5796,6 +6230,8 @@
           </w:tcPr>
           <w:p>
             <w:pPr>
+              <w:keepNext/>
+              <w:keepLines/>
               <w:jc w:val="left"/>
             </w:pPr>
             <w:r>
@@ -5827,6 +6263,8 @@
           </w:tcPr>
           <w:p>
             <w:pPr>
+              <w:keepNext/>
+              <w:keepLines/>
               <w:jc w:val="center"/>
             </w:pPr>
             <w:r>
@@ -5858,6 +6296,8 @@
           </w:tcPr>
           <w:p>
             <w:pPr>
+              <w:keepNext/>
+              <w:keepLines/>
               <w:jc w:val="center"/>
             </w:pPr>
             <w:r>
@@ -5889,6 +6329,8 @@
           </w:tcPr>
           <w:p>
             <w:pPr>
+              <w:keepNext/>
+              <w:keepLines/>
               <w:jc w:val="center"/>
             </w:pPr>
             <w:r>
@@ -5904,6 +6346,9 @@
         </w:tc>
       </w:tr>
       <w:tr>
+        <w:trPr>
+          <w:cantSplit/>
+        </w:trPr>
         <w:tc>
           <w:tcPr>
             <w:tcW w:type="dxa" w:w="2826"/>
@@ -5922,6 +6367,8 @@
           </w:tcPr>
           <w:p>
             <w:pPr>
+              <w:keepNext/>
+              <w:keepLines/>
               <w:jc w:val="left"/>
             </w:pPr>
             <w:r>
@@ -5953,6 +6400,8 @@
           </w:tcPr>
           <w:p>
             <w:pPr>
+              <w:keepNext/>
+              <w:keepLines/>
               <w:jc w:val="center"/>
             </w:pPr>
             <w:r>
@@ -5984,6 +6433,8 @@
           </w:tcPr>
           <w:p>
             <w:pPr>
+              <w:keepNext/>
+              <w:keepLines/>
               <w:jc w:val="center"/>
             </w:pPr>
             <w:r>
@@ -6015,6 +6466,8 @@
           </w:tcPr>
           <w:p>
             <w:pPr>
+              <w:keepNext/>
+              <w:keepLines/>
               <w:jc w:val="center"/>
             </w:pPr>
             <w:r>
@@ -6030,6 +6483,9 @@
         </w:tc>
       </w:tr>
       <w:tr>
+        <w:trPr>
+          <w:cantSplit/>
+        </w:trPr>
         <w:tc>
           <w:tcPr>
             <w:tcW w:type="dxa" w:w="2826"/>
@@ -6048,6 +6504,8 @@
           </w:tcPr>
           <w:p>
             <w:pPr>
+              <w:keepNext/>
+              <w:keepLines/>
               <w:jc w:val="left"/>
             </w:pPr>
             <w:r>
@@ -6079,6 +6537,8 @@
           </w:tcPr>
           <w:p>
             <w:pPr>
+              <w:keepNext/>
+              <w:keepLines/>
               <w:jc w:val="center"/>
             </w:pPr>
             <w:r>
@@ -6110,6 +6570,8 @@
           </w:tcPr>
           <w:p>
             <w:pPr>
+              <w:keepNext/>
+              <w:keepLines/>
               <w:jc w:val="center"/>
             </w:pPr>
             <w:r>
@@ -6141,6 +6603,8 @@
           </w:tcPr>
           <w:p>
             <w:pPr>
+              <w:keepNext/>
+              <w:keepLines/>
               <w:jc w:val="center"/>
             </w:pPr>
             <w:r>
@@ -6156,6 +6620,9 @@
         </w:tc>
       </w:tr>
       <w:tr>
+        <w:trPr>
+          <w:cantSplit/>
+        </w:trPr>
         <w:tc>
           <w:tcPr>
             <w:tcW w:type="dxa" w:w="2826"/>
@@ -6174,6 +6641,8 @@
           </w:tcPr>
           <w:p>
             <w:pPr>
+              <w:keepNext/>
+              <w:keepLines/>
               <w:jc w:val="left"/>
             </w:pPr>
             <w:r>
@@ -6205,6 +6674,8 @@
           </w:tcPr>
           <w:p>
             <w:pPr>
+              <w:keepNext/>
+              <w:keepLines/>
               <w:jc w:val="center"/>
             </w:pPr>
             <w:r>
@@ -6236,6 +6707,8 @@
           </w:tcPr>
           <w:p>
             <w:pPr>
+              <w:keepNext/>
+              <w:keepLines/>
               <w:jc w:val="center"/>
             </w:pPr>
             <w:r>
@@ -6267,6 +6740,8 @@
           </w:tcPr>
           <w:p>
             <w:pPr>
+              <w:keepNext/>
+              <w:keepLines/>
               <w:jc w:val="center"/>
             </w:pPr>
             <w:r>
@@ -6282,6 +6757,9 @@
         </w:tc>
       </w:tr>
       <w:tr>
+        <w:trPr>
+          <w:cantSplit/>
+        </w:trPr>
         <w:tc>
           <w:tcPr>
             <w:tcW w:type="dxa" w:w="2826"/>
@@ -6300,6 +6778,8 @@
           </w:tcPr>
           <w:p>
             <w:pPr>
+              <w:keepNext/>
+              <w:keepLines/>
               <w:jc w:val="left"/>
             </w:pPr>
             <w:r>
@@ -6331,6 +6811,8 @@
           </w:tcPr>
           <w:p>
             <w:pPr>
+              <w:keepNext/>
+              <w:keepLines/>
               <w:jc w:val="center"/>
             </w:pPr>
             <w:r>
@@ -6362,6 +6844,8 @@
           </w:tcPr>
           <w:p>
             <w:pPr>
+              <w:keepNext/>
+              <w:keepLines/>
               <w:jc w:val="center"/>
             </w:pPr>
             <w:r>
@@ -6393,6 +6877,8 @@
           </w:tcPr>
           <w:p>
             <w:pPr>
+              <w:keepNext/>
+              <w:keepLines/>
               <w:jc w:val="center"/>
             </w:pPr>
             <w:r>

</xml_diff>